<commit_message>
Deepen evaluation: extended metrics, ranking, effect sizes and variance analysis
- Correct metric naming: logged 'AccB' is plain accuracy, not balanced
  accuracy; balanced accuracy, kappa, MCC, G-mean, specificity and ITR are
  now computed from the stored confusion matrices (CLISA-EWU, DANN)
- Add Friedman/Kendall W/Nemenyi ranking, Cohen d_z and rank-biserial
  effect sizes, participant x seed variance decomposition with ICC, and
  correlation analyses, with 16 numbered equations
- Widen result tables (11-13 columns) and add per-class, Friedman,
  confusion-metric and variance tables plus four new figures

Co-Authored-By: Claude Opus 5.5 <noreply@anthropic.com>
Claude-Session: https://claude.ai/code/session_01NqsUunuCfCJVn4b3bAX4pE
</commit_message>
<xml_diff>
--- a/manuscript_draft/CLISA-EWU_presubmission_audit_and_roadmap.docx
+++ b/manuscript_draft/CLISA-EWU_presubmission_audit_and_roadmap.docx
@@ -1648,6 +1648,112 @@
                 <w:szCs w:val="17"/>
               </w:rPr>
               <w:t xml:space="preserve">Mark transductive methods in tables, or exclude them from the zero-shot comparison.</w:t>
+            </w:r>
+          </w:p>
+        </w:tc>
+      </w:tr>
+      <w:tr>
+        <w:tc>
+          <w:tcPr>
+            <w:tcW w:type="dxa" w:w="400"/>
+            <w:tcBorders>
+              <w:top w:val="single" w:color="A6A6A6" w:sz="4"/>
+              <w:left w:val="single" w:color="A6A6A6" w:sz="4"/>
+              <w:bottom w:val="single" w:color="A6A6A6" w:sz="4"/>
+              <w:right w:val="single" w:color="A6A6A6" w:sz="4"/>
+            </w:tcBorders>
+            <w:tcMar>
+              <w:top w:type="dxa" w:w="60"/>
+              <w:left w:type="dxa" w:w="90"/>
+              <w:bottom w:type="dxa" w:w="60"/>
+              <w:right w:type="dxa" w:w="90"/>
+            </w:tcMar>
+          </w:tcPr>
+          <w:p>
+            <w:r>
+              <w:rPr>
+                <w:sz w:val="17"/>
+                <w:szCs w:val="17"/>
+              </w:rPr>
+              <w:t xml:space="preserve">15</w:t>
+            </w:r>
+          </w:p>
+        </w:tc>
+        <w:tc>
+          <w:tcPr>
+            <w:tcW w:type="dxa" w:w="2300"/>
+            <w:tcBorders>
+              <w:top w:val="single" w:color="A6A6A6" w:sz="4"/>
+              <w:left w:val="single" w:color="A6A6A6" w:sz="4"/>
+              <w:bottom w:val="single" w:color="A6A6A6" w:sz="4"/>
+              <w:right w:val="single" w:color="A6A6A6" w:sz="4"/>
+            </w:tcBorders>
+            <w:tcMar>
+              <w:top w:type="dxa" w:w="60"/>
+              <w:left w:type="dxa" w:w="90"/>
+              <w:bottom w:type="dxa" w:w="60"/>
+              <w:right w:type="dxa" w:w="90"/>
+            </w:tcMar>
+          </w:tcPr>
+          <w:p>
+            <w:r>
+              <w:rPr>
+                <w:sz w:val="17"/>
+                <w:szCs w:val="17"/>
+              </w:rPr>
+              <w:t xml:space="preserve">"Balanced accuracy" is actually plain accuracy</w:t>
+            </w:r>
+          </w:p>
+        </w:tc>
+        <w:tc>
+          <w:tcPr>
+            <w:tcW w:type="dxa" w:w="3300"/>
+            <w:tcBorders>
+              <w:top w:val="single" w:color="A6A6A6" w:sz="4"/>
+              <w:left w:val="single" w:color="A6A6A6" w:sz="4"/>
+              <w:bottom w:val="single" w:color="A6A6A6" w:sz="4"/>
+              <w:right w:val="single" w:color="A6A6A6" w:sz="4"/>
+            </w:tcBorders>
+            <w:tcMar>
+              <w:top w:type="dxa" w:w="60"/>
+              <w:left w:type="dxa" w:w="90"/>
+              <w:bottom w:type="dxa" w:w="60"/>
+              <w:right w:type="dxa" w:w="90"/>
+            </w:tcMar>
+          </w:tcPr>
+          <w:p>
+            <w:r>
+              <w:rPr>
+                <w:sz w:val="17"/>
+                <w:szCs w:val="17"/>
+              </w:rPr>
+              <w:t xml:space="preserve">notebook 05, evaluate(): accuracy_score, not balanced_accuracy_score. Recomputed from confusion matrices: CLISA-EWU calibrated 0·678 (accuracy) vs 0·676 (balanced accuracy).</w:t>
+            </w:r>
+          </w:p>
+        </w:tc>
+        <w:tc>
+          <w:tcPr>
+            <w:tcW w:type="dxa" w:w="3026"/>
+            <w:tcBorders>
+              <w:top w:val="single" w:color="A6A6A6" w:sz="4"/>
+              <w:left w:val="single" w:color="A6A6A6" w:sz="4"/>
+              <w:bottom w:val="single" w:color="A6A6A6" w:sz="4"/>
+              <w:right w:val="single" w:color="A6A6A6" w:sz="4"/>
+            </w:tcBorders>
+            <w:tcMar>
+              <w:top w:type="dxa" w:w="60"/>
+              <w:left w:type="dxa" w:w="90"/>
+              <w:bottom w:type="dxa" w:w="60"/>
+              <w:right w:type="dxa" w:w="90"/>
+            </w:tcMar>
+          </w:tcPr>
+          <w:p>
+            <w:r>
+              <w:rPr>
+                <w:sz w:val="17"/>
+                <w:szCs w:val="17"/>
+              </w:rPr>
+              <w:t xml:space="preserve">Call the metric accuracy (done in the journal drafts); report balanced accuracy, κ and MCC from confusion matrices; store confusion matrices for every model in future runs.</w:t>
             </w:r>
           </w:p>
         </w:tc>

</xml_diff>